<commit_message>
Updated .NET detection code Removed expired .pfx cert Added new .p12 cert Updated documentation
git-svn-id: https://sources.ecopath.org/svn/Ecopath/trunk/Ecopath6@14175 a725721c-0ed6-864e-a6a8-02c2a1988c9d
</commit_message>
<xml_diff>
--- a/Sources Internal/Deployment/Installer/README Inno Setup.docx
+++ b/Sources Internal/Deployment/Installer/README Inno Setup.docx
@@ -67,10 +67,7 @@
     </w:p>
     <w:p>
       <w:r>
-        <w:t>For</w:t>
-      </w:r>
-      <w:r>
-        <w:t xml:space="preserve"> building the </w:t>
+        <w:t xml:space="preserve">For building the </w:t>
       </w:r>
       <w:proofErr w:type="spellStart"/>
       <w:r>
@@ -138,10 +135,7 @@
       </w:pPr>
       <w:proofErr w:type="spellStart"/>
       <w:r>
-        <w:t>I</w:t>
-      </w:r>
-      <w:r>
-        <w:t>nno</w:t>
+        <w:t>Inno</w:t>
       </w:r>
       <w:proofErr w:type="spellEnd"/>
       <w:r>
@@ -150,7 +144,26 @@
     </w:p>
     <w:p>
       <w:r>
-        <w:t>For code signing:</w:t>
+        <w:t>For code signing</w:t>
+      </w:r>
+      <w:r>
+        <w:t xml:space="preserve"> (per 1 Sept 2016 using a .</w:t>
+      </w:r>
+      <w:bookmarkStart w:id="0" w:name="_GoBack"/>
+      <w:bookmarkEnd w:id="0"/>
+      <w:r>
+        <w:t>p12 file instead of .</w:t>
+      </w:r>
+      <w:proofErr w:type="spellStart"/>
+      <w:r>
+        <w:t>pfx</w:t>
+      </w:r>
+      <w:proofErr w:type="spellEnd"/>
+      <w:r>
+        <w:t>)</w:t>
+      </w:r>
+      <w:r>
+        <w:t>:</w:t>
       </w:r>
     </w:p>
     <w:p>
@@ -161,11 +174,12 @@
           <w:numId w:val="2"/>
         </w:numPr>
       </w:pPr>
-      <w:proofErr w:type="spellStart"/>
-      <w:r>
-        <w:t>EII_cert.pfx</w:t>
-      </w:r>
-      <w:proofErr w:type="spellEnd"/>
+      <w:r>
+        <w:t>EII_cert.p</w:t>
+      </w:r>
+      <w:r>
+        <w:t>12</w:t>
+      </w:r>
     </w:p>
     <w:p>
       <w:pPr>
@@ -261,10 +275,7 @@
         </w:numPr>
       </w:pPr>
       <w:r>
-        <w:t>C:\Temp\Setup\</w:t>
-      </w:r>
-      <w:r>
-        <w:t xml:space="preserve">: </w:t>
+        <w:t xml:space="preserve">C:\Temp\Setup\: </w:t>
       </w:r>
       <w:proofErr w:type="spellStart"/>
       <w:r>
@@ -284,13 +295,7 @@
         </w:numPr>
       </w:pPr>
       <w:r>
-        <w:t>C:\BuildBot\slave\Ecopath6\Database\</w:t>
-      </w:r>
-      <w:r>
-        <w:t xml:space="preserve">: </w:t>
-      </w:r>
-      <w:r>
-        <w:t>SVN source path; contains EwE6 sample databases</w:t>
+        <w:t>C:\BuildBot\slave\Ecopath6\Database\: SVN source path; contains EwE6 sample databases</w:t>
       </w:r>
     </w:p>
     <w:p>
@@ -302,10 +307,7 @@
         </w:numPr>
       </w:pPr>
       <w:r>
-        <w:t>C:\Setup\</w:t>
-      </w:r>
-      <w:r>
-        <w:t xml:space="preserve">: Additional </w:t>
+        <w:t xml:space="preserve">C:\Setup\: Additional </w:t>
       </w:r>
       <w:proofErr w:type="spellStart"/>
       <w:r>
@@ -313,31 +315,7 @@
       </w:r>
       <w:proofErr w:type="spellEnd"/>
       <w:r>
-        <w:t xml:space="preserve"> Setup script </w:t>
-      </w:r>
-      <w:r>
-        <w:t xml:space="preserve">resources, </w:t>
-      </w:r>
-      <w:r>
-        <w:t>with files “</w:t>
-      </w:r>
-      <w:r>
-        <w:t>EwE5Logo.bmp</w:t>
-      </w:r>
-      <w:r>
-        <w:t>”, “</w:t>
-      </w:r>
-      <w:r>
-        <w:t>EwE6Header.bmp</w:t>
-      </w:r>
-      <w:r>
-        <w:t>”, “</w:t>
-      </w:r>
-      <w:r>
-        <w:t>Ecopath_install.ico</w:t>
-      </w:r>
-      <w:r>
-        <w:t>”</w:t>
+        <w:t xml:space="preserve"> Setup script resources, with files “EwE5Logo.bmp”, “EwE6Header.bmp”, “Ecopath_install.ico”</w:t>
       </w:r>
     </w:p>
     <w:p>
@@ -419,13 +397,11 @@
       </w:r>
       <w:proofErr w:type="spellEnd"/>
       <w:r>
-        <w:t>}\</w:t>
-      </w:r>
-      <w:proofErr w:type="spellStart"/>
-      <w:r>
-        <w:t>EII_cert.pfx</w:t>
-      </w:r>
-      <w:proofErr w:type="spellEnd"/>
+        <w:t>}\EII_cert.p</w:t>
+      </w:r>
+      <w:r>
+        <w:t>12</w:t>
+      </w:r>
       <w:r>
         <w:t xml:space="preserve"> /p IML@AERL $p</w:t>
       </w:r>
@@ -476,13 +452,11 @@
       </w:r>
       <w:proofErr w:type="spellEnd"/>
       <w:r>
-        <w:t>}\</w:t>
-      </w:r>
-      <w:proofErr w:type="spellStart"/>
-      <w:r>
-        <w:t>EII_cert.pfx</w:t>
-      </w:r>
-      <w:proofErr w:type="spellEnd"/>
+        <w:t>}\EII_cert.p</w:t>
+      </w:r>
+      <w:r>
+        <w:t>12</w:t>
+      </w:r>
       <w:r>
         <w:t xml:space="preserve"> /p IML@AERL $p" {</w:t>
       </w:r>
@@ -514,10 +488,7 @@
       </w:r>
       <w:proofErr w:type="spellEnd"/>
       <w:r>
-        <w:t xml:space="preserve">: drive + </w:t>
-      </w:r>
-      <w:r>
-        <w:t xml:space="preserve">directory that contains </w:t>
+        <w:t xml:space="preserve">: drive + directory that contains </w:t>
       </w:r>
       <w:proofErr w:type="spellStart"/>
       <w:r>
@@ -542,10 +513,7 @@
       </w:r>
       <w:proofErr w:type="spellEnd"/>
       <w:r>
-        <w:t xml:space="preserve">: </w:t>
-      </w:r>
-      <w:r>
-        <w:t>drive + directory that contains signtool.exe, installed with Windows SDK</w:t>
+        <w:t>: drive + directory that contains signtool.exe, installed with Windows SDK</w:t>
       </w:r>
     </w:p>
     <w:p>
@@ -562,16 +530,11 @@
       </w:r>
       <w:proofErr w:type="spellEnd"/>
       <w:r>
-        <w:t xml:space="preserve">: </w:t>
-      </w:r>
-      <w:r>
-        <w:t xml:space="preserve">drive + directory that contains </w:t>
-      </w:r>
-      <w:proofErr w:type="spellStart"/>
-      <w:r>
-        <w:t>EII_cert.pfx</w:t>
-      </w:r>
-      <w:proofErr w:type="spellEnd"/>
+        <w:t>: drive + directory that contains EII_cert.p</w:t>
+      </w:r>
+      <w:r>
+        <w:t>12</w:t>
+      </w:r>
     </w:p>
     <w:p>
       <w:pPr>
@@ -587,15 +550,7 @@
       </w:r>
       <w:proofErr w:type="spellEnd"/>
       <w:r>
-        <w:t xml:space="preserve">: </w:t>
-      </w:r>
-      <w:r>
-        <w:t xml:space="preserve">drive + </w:t>
-      </w:r>
-      <w:bookmarkStart w:id="0" w:name="_GoBack"/>
-      <w:bookmarkEnd w:id="0"/>
-      <w:r>
-        <w:t xml:space="preserve">directory that contains the </w:t>
+        <w:t xml:space="preserve">: drive + directory that contains the </w:t>
       </w:r>
       <w:proofErr w:type="spellStart"/>
       <w:r>

</xml_diff>